<commit_message>
docs: remove the unimplemented student data crawler step from the test report
Co-Authored-By: Claude Opus 5.5 <noreply@anthropic.com>
</commit_message>
<xml_diff>
--- a/Bao_Cao_Kiem_Thu_He_Thong_ITC_Care.docx
+++ b/Bao_Cao_Kiem_Thu_He_Thong_ITC_Care.docx
@@ -193,83 +193,7 @@
           <w:color w:val="1E40AF"/>
           <w:sz w:val="24"/>
         </w:rPr>
-        <w:t>Bước 1.2: Thu Thập Dữ Liệu Sinh Viên &amp; Cấu Hình Crawler Dải Mã Ngành</w:t>
-        <w:br/>
-      </w:r>
-    </w:p>
-    <w:p>
-      <w:pPr>
-        <w:spacing w:after="160"/>
-      </w:pPr>
-      <w:r>
-        <w:t>Admin chọn Năm học / Học kỳ trên Dashboard, kích hoạt Trình quét Crawler đa luồng để cào dữ liệu sinh viên từ cổng tra cứu của trường dựa trên Dải mã ngành động cấu hình.</w:t>
-      </w:r>
-    </w:p>
-    <w:p>
-      <w:pPr>
-        <w:spacing w:before="80" w:after="40"/>
-        <w:jc w:val="center"/>
-      </w:pPr>
-      <w:r>
-        <w:drawing>
-          <wp:inline xmlns:a="http://schemas.openxmlformats.org/drawingml/2006/main" xmlns:pic="http://schemas.openxmlformats.org/drawingml/2006/picture">
-            <wp:extent cx="5303520" cy="3494266"/>
-            <wp:docPr id="2" name="Picture 2"/>
-            <wp:cNvGraphicFramePr>
-              <a:graphicFrameLocks noChangeAspect="1"/>
-            </wp:cNvGraphicFramePr>
-            <a:graphic>
-              <a:graphicData uri="http://schemas.openxmlformats.org/drawingml/2006/picture">
-                <pic:pic>
-                  <pic:nvPicPr>
-                    <pic:cNvPr id="0" name="1_2_System_Config_Master.png"/>
-                    <pic:cNvPicPr/>
-                  </pic:nvPicPr>
-                  <pic:blipFill>
-                    <a:blip r:embed="rId10"/>
-                    <a:stretch>
-                      <a:fillRect/>
-                    </a:stretch>
-                  </pic:blipFill>
-                  <pic:spPr>
-                    <a:xfrm>
-                      <a:off x="0" y="0"/>
-                      <a:ext cx="5303520" cy="3494266"/>
-                    </a:xfrm>
-                    <a:prstGeom prst="rect"/>
-                  </pic:spPr>
-                </pic:pic>
-              </a:graphicData>
-            </a:graphic>
-          </wp:inline>
-        </w:drawing>
-      </w:r>
-    </w:p>
-    <w:p>
-      <w:pPr>
-        <w:spacing w:after="200"/>
-        <w:jc w:val="center"/>
-      </w:pPr>
-      <w:r>
-        <w:rPr>
-          <w:i/>
-          <w:color w:val="64748B"/>
-          <w:sz w:val="19"/>
-        </w:rPr>
-        <w:t>Hình 1.2: Thu Thập Dữ Liệu Sinh Viên &amp; Cấu Hình Crawler Dải Mã Ngành</w:t>
-      </w:r>
-    </w:p>
-    <w:p>
-      <w:pPr>
-        <w:spacing w:before="200" w:after="80"/>
-      </w:pPr>
-      <w:r>
-        <w:rPr>
-          <w:b/>
-          <w:color w:val="1E40AF"/>
-          <w:sz w:val="24"/>
-        </w:rPr>
-        <w:t>Bước 1.3: Nhập File Excel Mẫu Đa Học Phần (Kiểm thử 1 Sinh Viên học nhiều Nhóm HP)</w:t>
+        <w:t>Bước 1.2: Nhập File Excel Mẫu Đa Học Phần (Kiểm thử 1 Sinh Viên học nhiều Nhóm HP)</w:t>
         <w:br/>
       </w:r>
     </w:p>
@@ -332,7 +256,7 @@
           <w:color w:val="64748B"/>
           <w:sz w:val="19"/>
         </w:rPr>
-        <w:t>Hình 1.3: Nhập File Excel Mẫu Đa Học Phần (Kiểm thử 1 Sinh Viên học nhiều Nhóm HP)</w:t>
+        <w:t>Hình 1.2: Nhập File Excel Mẫu Đa Học Phần (Kiểm thử 1 Sinh Viên học nhiều Nhóm HP)</w:t>
       </w:r>
     </w:p>
     <w:p>
@@ -345,7 +269,7 @@
           <w:color w:val="1E40AF"/>
           <w:sz w:val="24"/>
         </w:rPr>
-        <w:t>Bước 1.4: Quản Lý Nhân Sự CSKH &amp; Gán Lớp Sinh Hoạt Cố Định</w:t>
+        <w:t>Bước 1.3: Quản Lý Nhân Sự CSKH &amp; Gán Lớp Sinh Hoạt Cố Định</w:t>
         <w:br/>
       </w:r>
     </w:p>
@@ -408,7 +332,7 @@
           <w:color w:val="64748B"/>
           <w:sz w:val="19"/>
         </w:rPr>
-        <w:t>Hình 1.4: Quản Lý Nhân Sự CSKH &amp; Gán Lớp Sinh Hoạt Cố Định</w:t>
+        <w:t>Hình 1.3: Quản Lý Nhân Sự CSKH &amp; Gán Lớp Sinh Hoạt Cố Định</w:t>
       </w:r>
     </w:p>
     <w:p>

</xml_diff>